<commit_message>
Kết luận toàn báo cáo: rút gọn còn dưới 2 trang A4
Co-Authored-By: Claude Opus 5.5 <noreply@anthropic.com>
Claude-Session: https://claude.ai/code/session_01KCHGbv2ffzJ8gQrm7iA6oT
</commit_message>
<xml_diff>
--- a/bao_cao_chuong3/Ket_luan.docx
+++ b/bao_cao_chuong3/Ket_luan.docx
@@ -34,7 +34,7 @@
         <w:jc w:val="both"/>
       </w:pPr>
       <w:r>
-        <w:t>Đề tài đã thiết kế, chế tạo và hiệu chỉnh hệ ổn định Gimbal hai trục Yaw – Pitch trên STM32F407VET6 và hệ điều hành thời gian thực Apache NuttX, dùng hai cảm biến ICM20948 (IMU1 trên khối camera cho phản hồi, IMU2 trên khung mang đo chuyển động cần bù) và hai động cơ MS3506 dùng chung bus RS485. Chuỗi điều khiển gồm bộ điều khiển nối tầng (cascade) góc 100 Hz – tốc độ góc 500 Hz, bù chuyển động khung mang từ IMU2, ngoại suy bù trễ, giới hạn lệnh theo trạng thái chuyển động, xử lý đảo chiều và dừng, tạo dạng lệnh và lịch truyền RS485 luân phiên, thực thi trên bảy luồng có mức ưu tiên và nhịp riêng, kèm lớp giám sát, bảo vệ và khôi phục.</w:t>
+        <w:t>Đề tài đã thiết kế, chế tạo và hiệu chỉnh hệ ổn định Gimbal hai trục Yaw – Pitch trên STM32F407VET6 và Apache NuttX, dùng hai cảm biến ICM20948 (IMU1 trên camera cho phản hồi, IMU2 trên khung mang đo chuyển động cần bù) và hai động cơ MS3506 dùng chung bus RS485. Chuỗi điều khiển gồm bộ điều khiển nối tầng góc 100 Hz – tốc độ góc 500 Hz, bù chuyển động khung mang, ngoại suy bù trễ, giới hạn lệnh theo trạng thái, xử lý đảo chiều và dừng, tạo dạng lệnh và lịch RS485 luân phiên, thực thi trên bảy luồng thời gian thực kèm lớp giám sát, bảo vệ.</w:t>
       </w:r>
     </w:p>
     <w:p>
@@ -57,7 +57,34 @@
         <w:jc w:val="both"/>
       </w:pPr>
       <w:r>
-        <w:t>Thứ nhất, Chương 1 đã quy năm nhóm nguyên nhân làm giảm chất lượng ổn định về sáu hướng hiệu chỉnh (Bảng 1.5); Chương 2 hiện thực các hướng đó thành một chuỗi biến đổi lệnh nhiều lớp, mỗi khâu có đầu vào, đầu ra và tham số xác định (Bảng 2.6), nhờ đó từng khâu được bổ sung và đánh giá riêng ở Chương 3.</w:t>
+        <w:t>Thứ nhất, mô hình mô phỏng được xây dựng từ phép thử vòng hở (τ</w:t>
+      </w:r>
+      <w:r>
+        <w:rPr>
+          <w:vertAlign w:val="subscript"/>
+        </w:rPr>
+        <w:t>d</w:t>
+      </w:r>
+      <w:r>
+        <w:t xml:space="preserve"> = 12 ms; T</w:t>
+      </w:r>
+      <w:r>
+        <w:rPr>
+          <w:vertAlign w:val="subscript"/>
+        </w:rPr>
+        <w:t>m</w:t>
+      </w:r>
+      <w:r>
+        <w:t xml:space="preserve"> = 13 / 4 ms) và dùng ở hai mức: mô phỏng khảo sát để chọn tham số; mô phỏng tái hiện, hiệu chỉnh theo log A, để ước lượng các cấu hình trung gian với cùng kích thích. Mô hình tái hiện khớp số đo về e</w:t>
+      </w:r>
+      <w:r>
+        <w:rPr>
+          <w:vertAlign w:val="subscript"/>
+        </w:rPr>
+        <w:t>rms</w:t>
+      </w:r>
+      <w:r>
+        <w:t xml:space="preserve"> trong 8,4 % (Yaw) và 4,8 % (Pitch).</w:t>
       </w:r>
     </w:p>
     <w:p>
@@ -66,34 +93,34 @@
         <w:jc w:val="both"/>
       </w:pPr>
       <w:r>
-        <w:t>Thứ hai, mô hình mô phỏng được xây dựng từ phép thử vòng hở (τ</w:t>
+        <w:t>Thứ hai, qua tám cấu hình tích lũy, e</w:t>
       </w:r>
       <w:r>
         <w:rPr>
           <w:vertAlign w:val="subscript"/>
         </w:rPr>
-        <w:t>d</w:t>
-      </w:r>
-      <w:r>
-        <w:t xml:space="preserve"> = 12 ms; T</w:t>
+        <w:t>rms</w:t>
+      </w:r>
+      <w:r>
+        <w:t xml:space="preserve"> tái hiện giảm từ 5,46° xuống 0,182° (96,7 %) ở Yaw và từ 2,70° xuống 0,192° (92,9 %) ở Pitch. Ba bước quyết định là bù từ IMU2 (giảm 89,3 % / 79,5 %), ngoại suy bù trễ τ</w:t>
       </w:r>
       <w:r>
         <w:rPr>
           <w:vertAlign w:val="subscript"/>
         </w:rPr>
-        <w:t>m</w:t>
-      </w:r>
-      <w:r>
-        <w:t xml:space="preserve"> = 13 ms cho Yaw, 4 ms cho Pitch) và dùng ở hai mức: mô phỏng khảo sát trên mô hình danh định để chọn tham số; mô phỏng tái hiện, hiệu chỉnh theo bản ghi đo log A (trễ tương đương τ</w:t>
+        <w:t>p</w:t>
+      </w:r>
+      <w:r>
+        <w:t xml:space="preserve"> = 12 ms (giảm tiếp 35,2 % / 40,3 %) và giới hạn lệnh theo vùng, tới 410 °/s ở vùng rất nhanh (giảm tiếp 42,2 % / 35,3 %, bão hòa lệnh về gần 0). Xử lý đảo chiều, dừng và tạo dạng lệnh cải thiện trạng thái giữ và độ êm của lệnh với chi phí mỗi khâu không quá 3,7 % e</w:t>
       </w:r>
       <w:r>
         <w:rPr>
           <w:vertAlign w:val="subscript"/>
         </w:rPr>
-        <w:t>e</w:t>
-      </w:r>
-      <w:r>
-        <w:t xml:space="preserve"> = 8 / 10 ms, hệ số đường bù IMU2 1,06 / 1,02), để ước lượng các cấu hình trung gian với cùng kích thích là chuyển động khung mang đã ghi lại. Mô hình tái hiện khớp số đo về e</w:t>
+        <w:t>rms</w:t>
+      </w:r>
+      <w:r>
+        <w:t>. Lịch luân phiên khe 5 ms được chọn trong bốn phương án vì là phương án duy nhất vừa cho khoảng cập nhật có cận trên xác định, vừa còn dự trữ khe 1,5 ms: e</w:t>
       </w:r>
       <w:r>
         <w:rPr>
@@ -102,7 +129,7 @@
         <w:t>rms</w:t>
       </w:r>
       <w:r>
-        <w:t xml:space="preserve"> trong 8,4 % (Yaw) và 4,8 % (Pitch), trong khi mô hình danh định cho e</w:t>
+        <w:t xml:space="preserve"> Pitch giảm 9,5 %, đổi lại e</w:t>
       </w:r>
       <w:r>
         <w:rPr>
@@ -111,7 +138,7 @@
         <w:t>rms</w:t>
       </w:r>
       <w:r>
-        <w:t xml:space="preserve"> trục Yaw gần gấp đôi số đo.</w:t>
+        <w:t xml:space="preserve"> Yaw tăng 19,5 %.</w:t>
       </w:r>
     </w:p>
     <w:p>
@@ -120,7 +147,7 @@
         <w:jc w:val="both"/>
       </w:pPr>
       <w:r>
-        <w:t>Thứ ba, quá trình hoàn thiện gồm bảy bước qua tám cấu hình tích lũy, mỗi bước theo cùng trình tự vấn đề – mô phỏng khảo sát – lựa chọn – áp dụng và so sánh trước, sau trên hai trục. e</w:t>
+        <w:t>Thứ ba, trên hệ thật, khi khung mang lắc ±27° / ±23° với tốc độ góc đỉnh 225 °/s, cấu hình hoàn thiện đạt e</w:t>
       </w:r>
       <w:r>
         <w:rPr>
@@ -129,178 +156,16 @@
         <w:t>rms</w:t>
       </w:r>
       <w:r>
-        <w:t xml:space="preserve"> tái hiện trên bài thử tham chiếu giảm từ 5,46° xuống 0,182° (96,7 %) ở Yaw và từ 2,70° xuống 0,192° (92,9 %) ở Pitch. Hiệu chỉnh nối tầng (K</w:t>
+        <w:t xml:space="preserve"> = 0,199° (Yaw) và 0,201° (Pitch), e</w:t>
       </w:r>
       <w:r>
         <w:rPr>
           <w:vertAlign w:val="subscript"/>
         </w:rPr>
-        <w:t>pθ</w:t>
-      </w:r>
-      <w:r>
-        <w:t xml:space="preserve"> = 9,5 / 38 s</w:t>
-      </w:r>
-      <w:r>
-        <w:rPr>
-          <w:vertAlign w:val="superscript"/>
-        </w:rPr>
-        <w:t>−1</w:t>
-      </w:r>
-      <w:r>
-        <w:t>, K</w:t>
-      </w:r>
-      <w:r>
-        <w:rPr>
-          <w:vertAlign w:val="subscript"/>
-        </w:rPr>
-        <w:t>pω</w:t>
-      </w:r>
-      <w:r>
-        <w:t xml:space="preserve"> = 0,28 / 0,15, K</w:t>
-      </w:r>
-      <w:r>
-        <w:rPr>
-          <w:vertAlign w:val="subscript"/>
-        </w:rPr>
-        <w:t>iω</w:t>
-      </w:r>
-      <w:r>
-        <w:t xml:space="preserve"> = 1,0 / 0,5 s</w:t>
-      </w:r>
-      <w:r>
-        <w:rPr>
-          <w:vertAlign w:val="superscript"/>
-        </w:rPr>
-        <w:t>−1</w:t>
-      </w:r>
-      <w:r>
-        <w:t>) rút ngắn thời gian tăng trục Yaw 45 % nhưng e</w:t>
-      </w:r>
-      <w:r>
-        <w:rPr>
-          <w:vertAlign w:val="subscript"/>
-        </w:rPr>
-        <w:t>rms</w:t>
-      </w:r>
-      <w:r>
-        <w:t xml:space="preserve"> chỉ giảm 30,4 % / 6,4 %, vì cấu trúc chỉ có phản hồi không khử được sai lệch tỉ lệ với tốc độ khung mang. Ba bước quyết định là bù từ IMU2 với hệ số k(v) theo vùng (e</w:t>
-      </w:r>
-      <w:r>
-        <w:rPr>
-          <w:vertAlign w:val="subscript"/>
-        </w:rPr>
-        <w:t>rms</w:t>
-      </w:r>
-      <w:r>
-        <w:t xml:space="preserve"> giảm 89,3 % / 79,5 %), ngoại suy bù trễ τ</w:t>
-      </w:r>
-      <w:r>
-        <w:rPr>
-          <w:vertAlign w:val="subscript"/>
-        </w:rPr>
-        <w:t>p</w:t>
-      </w:r>
-      <w:r>
-        <w:t xml:space="preserve"> = 12 ms (giảm tiếp 35,2 % / 40,3 %) và giới hạn lệnh theo vùng 110 / 135 / 165 °/s, vùng rất nhanh tới 410 °/s (giảm tiếp 42,2 % / 35,3 %, bão hòa lệnh về gần 0).</w:t>
-      </w:r>
-    </w:p>
-    <w:p>
-      <w:pPr>
-        <w:ind w:firstLine="567"/>
-        <w:jc w:val="both"/>
-      </w:pPr>
-      <w:r>
-        <w:t>Thứ tư, các khâu hoàn thiện được chọn với đánh đổi đã lượng hóa. Xử lý đảo chiều (t</w:t>
-      </w:r>
-      <w:r>
-        <w:rPr>
-          <w:vertAlign w:val="subscript"/>
-        </w:rPr>
-        <w:t>0max</w:t>
-      </w:r>
-      <w:r>
-        <w:t xml:space="preserve"> = 10 ms, α</w:t>
-      </w:r>
-      <w:r>
-        <w:rPr>
-          <w:vertAlign w:val="subscript"/>
-        </w:rPr>
-        <w:t>rev</w:t>
-      </w:r>
-      <w:r>
-        <w:t xml:space="preserve"> = 1 000 °/s²), chế độ dừng (ngưỡng 1 °/s) và tạo dạng lệnh (a</w:t>
-      </w:r>
-      <w:r>
-        <w:rPr>
-          <w:vertAlign w:val="subscript"/>
-        </w:rPr>
         <w:t>max</w:t>
       </w:r>
       <w:r>
-        <w:t xml:space="preserve"> = 18 000 / 30 000 °/s²) không nhằm giảm e</w:t>
-      </w:r>
-      <w:r>
-        <w:rPr>
-          <w:vertAlign w:val="subscript"/>
-        </w:rPr>
-        <w:t>rms</w:t>
-      </w:r>
-      <w:r>
-        <w:t xml:space="preserve"> mà xử lý trạng thái giữ và độ êm của lệnh, mỗi khâu làm e</w:t>
-      </w:r>
-      <w:r>
-        <w:rPr>
-          <w:vertAlign w:val="subscript"/>
-        </w:rPr>
-        <w:t>rms</w:t>
-      </w:r>
-      <w:r>
-        <w:t xml:space="preserve"> thay đổi không quá 3,7 %; độ lệch chuẩn lệnh trục Yaw khi giữ giảm 85 %, bước lệnh lớn nhất trục Pitch giảm 38 %. Lịch truyền RS485 được chọn trong bốn phương án theo ba tiêu chí (khoảng cập nhật có cận trên xác định, sai lệch trục kém hơn nhỏ nhất, dự trữ khe ít nhất 1 ms); lịch luân phiên khe 5 ms là phương án duy nhất thỏa cả ba: khoảng cập nhật lớn nhất trục Pitch giảm từ 32,3 xuống 12,5 ms, e</w:t>
-      </w:r>
-      <w:r>
-        <w:rPr>
-          <w:vertAlign w:val="subscript"/>
-        </w:rPr>
-        <w:t>rms</w:t>
-      </w:r>
-      <w:r>
-        <w:t xml:space="preserve"> Pitch giảm 9,5 %, đổi lại e</w:t>
-      </w:r>
-      <w:r>
-        <w:rPr>
-          <w:vertAlign w:val="subscript"/>
-        </w:rPr>
-        <w:t>rms</w:t>
-      </w:r>
-      <w:r>
-        <w:t xml:space="preserve"> Yaw tăng 19,5 % và hai trục trở nên cân bằng.</w:t>
-      </w:r>
-    </w:p>
-    <w:p>
-      <w:pPr>
-        <w:ind w:firstLine="567"/>
-        <w:jc w:val="both"/>
-      </w:pPr>
-      <w:r>
-        <w:t>Thứ năm, trên hệ thật, khi khung mang được lắc ±27° quanh trục đứng, ±23° quanh trục ngang với tốc độ góc đỉnh 225 °/s, cấu hình hoàn thiện đạt e</w:t>
-      </w:r>
-      <w:r>
-        <w:rPr>
-          <w:vertAlign w:val="subscript"/>
-        </w:rPr>
-        <w:t>rms</w:t>
-      </w:r>
-      <w:r>
-        <w:t xml:space="preserve"> = 0,199° (Yaw) và 0,201° (Pitch), e</w:t>
-      </w:r>
-      <w:r>
-        <w:rPr>
-          <w:vertAlign w:val="subscript"/>
-        </w:rPr>
-        <w:t>max</w:t>
-      </w:r>
-      <w:r>
-        <w:t xml:space="preserve"> = 0,62° và 0,67°; sai lệch lớn nhất xuất hiện khi khung mang đổi chiều. Độ lệch chuẩn góc khi giữ tĩnh là 0,0076° / 0,0077°. Tuyến RS485 thực hiện 7 676 giao dịch mỗi trục trong 76,3 s (100,6 Hz), không có giao dịch lỗi hay quá hạn. Theo Bảng 3.16, hệ đạt các chỉ tiêu khử nhiễu, độ chính xác giữ tĩnh, vọt lố trục Yaw và tần số cập nhật.</w:t>
+        <w:t xml:space="preserve"> = 0,62° và 0,67°; độ lệch chuẩn khi giữ tĩnh 0,0076° / 0,0077°; tuyến RS485 cập nhật 100,6 Hz mỗi trục, không có giao dịch lỗi. Hệ đạt các chỉ tiêu khử nhiễu, độ chính xác giữ tĩnh và tần số cập nhật (Bảng 3.16).</w:t>
       </w:r>
     </w:p>
     <w:p>
@@ -323,25 +188,16 @@
         <w:jc w:val="both"/>
       </w:pPr>
       <w:r>
-        <w:t>Chỉ cấu hình hoàn thiện có bản ghi đo; số liệu bảy cấu hình trung gian là ước lượng bằng mô phỏng tái hiện, và mô hình chưa mô tả tương tác giữa hai trục qua kết cấu. Tuyến RS485 chưa tất định hoàn toàn: khoảng cập nhật lớn nhất đo được 16 / 14 ms, vượt chu kỳ danh định 10 ms tới 60 %, giao dịch dài nhất 8 ms vượt khe 5 ms khi luồng RS485 bị chen ngang, lúc đó trễ thực tế lớn hơn τ</w:t>
+        <w:t>Số liệu bảy cấu hình trung gian là ước lượng bằng mô phỏng tái hiện. Khoảng cập nhật RS485 lớn nhất đo được 16 / 14 ms và giao dịch dài nhất 8 ms, vượt khe 5 ms khi luồng truyền thông bị chen ngang. Trục Pitch vọt lố khoảng 7,8 % do K</w:t>
       </w:r>
       <w:r>
         <w:rPr>
           <w:vertAlign w:val="subscript"/>
         </w:rPr>
-        <w:t>p</w:t>
-      </w:r>
-      <w:r>
-        <w:t>. Độ vọt lố bậc thang trục Pitch khoảng 7,8 % (mô phỏng tái hiện), chưa đạt chỉ tiêu dưới 1 %, do K</w:t>
-      </w:r>
-      <w:r>
-        <w:rPr>
-          <w:vertAlign w:val="subscript"/>
-        </w:rPr>
         <w:t>pθ</w:t>
       </w:r>
       <w:r>
-        <w:t xml:space="preserve"> được chọn ưu tiên khử nhiễu. Hiệu quả của xử lý đảo chiều và chế độ dừng chưa được xác nhận bằng thực nghiệm; vùng tốc độ trên 225 °/s mới được kiểm tra bằng mô phỏng. Bộ lọc chắn dải chưa đưa vào vận hành do tần số cộng hưởng chưa được xác nhận lặp lại; trục Yaw chưa có mốc phương vị tuyệt đối do không dùng từ kế.</w:t>
+        <w:t xml:space="preserve"> được chọn ưu tiên khử nhiễu. Hiệu quả của xử lý đảo chiều, dừng và vùng tốc độ trên 225 °/s chưa được xác nhận bằng thực nghiệm; bộ lọc chắn dải chưa đưa vào vận hành; trục Yaw chưa có mốc phương vị tuyệt đối.</w:t>
       </w:r>
     </w:p>
     <w:p>
@@ -364,52 +220,7 @@
         <w:jc w:val="both"/>
       </w:pPr>
       <w:r>
-        <w:t>– Ghi đo từng cấu hình trung gian trên giá thử tạo được kích thích lặp lại và vượt 225 °/s, để kiểm chứng trực tiếp đóng góp của từng khâu và bổ sung tương tác hai trục vào mô hình.</w:t>
-      </w:r>
-    </w:p>
-    <w:p>
-      <w:pPr>
-        <w:ind w:firstLine="567"/>
-        <w:jc w:val="both"/>
-      </w:pPr>
-      <w:r>
-        <w:t>– Nâng tính tất định của RS485: giảm chen ngang luồng truyền thông (DMA, ngắt kết thúc khung), khi giao dịch dài nhất dưới 3,5 ms có thể dùng khe 4 ms (124 Hz mỗi trục); về lâu dài tách bus riêng từng trục hoặc dùng CAN, kết hợp khoảng ngoại suy thích nghi theo tuổi thực của lệnh.</w:t>
-      </w:r>
-    </w:p>
-    <w:p>
-      <w:pPr>
-        <w:ind w:firstLine="567"/>
-        <w:jc w:val="both"/>
-      </w:pPr>
-      <w:r>
-        <w:t>– Giảm vọt lố trục Pitch bằng lọc hoặc giới hạn tốc độ thay đổi góc đặt thay vì giảm K</w:t>
-      </w:r>
-      <w:r>
-        <w:rPr>
-          <w:vertAlign w:val="subscript"/>
-        </w:rPr>
-        <w:t>pθ</w:t>
-      </w:r>
-      <w:r>
-        <w:t>; quét tần số để xác nhận cộng hưởng và đưa bộ lọc chắn dải vào vận hành.</w:t>
-      </w:r>
-    </w:p>
-    <w:p>
-      <w:pPr>
-        <w:ind w:firstLine="567"/>
-        <w:jc w:val="both"/>
-      </w:pPr>
-      <w:r>
-        <w:t>– Bổ sung tham chiếu phương vị cho trục Yaw (từ kế hoặc la bàn GNSS) và nghiên cứu điều khiển trực tiếp dòng I</w:t>
-      </w:r>
-      <w:r>
-        <w:rPr>
-          <w:vertAlign w:val="subscript"/>
-        </w:rPr>
-        <w:t>q</w:t>
-      </w:r>
-      <w:r>
-        <w:t xml:space="preserve"> để rút ngắn trễ của vòng tốc độ.</w:t>
+        <w:t>Ghi đo từng cấu hình trên giá thử tạo được kích thích lặp lại; giảm chen ngang luồng RS485 (DMA, ngắt kết thúc khung) để có thể dùng khe 4 ms, về lâu dài tách bus từng trục hoặc dùng CAN kết hợp ngoại suy thích nghi; giảm vọt lố trục Pitch bằng lọc góc đặt; quét tần số để đưa bộ lọc chắn dải vào vận hành; bổ sung tham chiếu phương vị (từ kế hoặc GNSS) cho trục Yaw.</w:t>
       </w:r>
     </w:p>
     <w:sectPr>

</xml_diff>